<commit_message>
Docs: tabs, inflation on every chart, Saved plans, PowerShell run steps
README and the project detail docx now describe the card tabs, the shared
chart line model with the Inflation line and the My Portfolio after
inflation drawdown, Save as plan / Saved plans, the inflation series in the
portfolio-backtest API, the yearly bonds booking, the GitHub repo and the
PowerShell steps (token via Read-Host, first-time installs).

Co-Authored-By: Claude Opus 5.5 <noreply@anthropic.com>
</commit_message>
<xml_diff>
--- a/docs/Asset_Allocation_Backtest_Project_Detail.docx
+++ b/docs/Asset_Allocation_Backtest_Project_Detail.docx
@@ -3283,7 +3283,7 @@
         <w:rPr>
           <w:rFonts w:ascii="Calibri" w:cs="Calibri" w:eastAsia="Calibri" w:hAnsi="Calibri"/>
         </w:rPr>
-        <w:t xml:space="preserve">Charts and tables: portfolio vs 100% in each asset and inflation; drawdown chart with worst-fall chips; allocation donut; comparison table; Year by year table with a '1995 Dec close (buy)' row showing the Nifty shares and gold grams bought and the closing prices they were bought at (Nifty 909.00, gold Rs 462.42 per gram).</w:t>
+        <w:t xml:space="preserve">Tabs (card tabs with icons): Asset Allocation, Rebalance, Backtester, Saved plans. Save as plan (under the sliders) stores the weights as a custom allocation; the Saved plans tab loads one back into the sliders or opens it in the Backtester.</w:t>
       </w:r>
     </w:p>
     <w:p>
@@ -3299,7 +3299,7 @@
         <w:rPr>
           <w:rFonts w:ascii="Calibri" w:cs="Calibri" w:eastAsia="Calibri" w:hAnsi="Calibri"/>
         </w:rPr>
-        <w:t xml:space="preserve">Rebalance page (header button): value with vs without rebalancing, the latest review's buy / reduce amounts and a Year by year (with rebalancing) table like the main page's: the 1995 Dec buy row, then every December the amount in each asset at the close (Nifty shares / gold grams held at that price), what is sold or bought (with the shares / grams), and the amount and shares after; shares and grams change only in a December when the portfolio is rebalanced.</w:t>
+        <w:t xml:space="preserve">Charts: every chart uses the same line model - a key box at the top-left, 100% in each asset, a purple Inflation line and a thick pink My Portfolio line; every drawdown chart adds a purple My Portfolio after inflation line with its worst fall.</w:t>
       </w:r>
     </w:p>
     <w:p>
@@ -3315,7 +3315,39 @@
         <w:rPr>
           <w:rFonts w:ascii="Calibri" w:cs="Calibri" w:eastAsia="Calibri" w:hAnsi="Calibri"/>
         </w:rPr>
-        <w:t xml:space="preserve">Backtester (header button): daily-close Buy &amp; Hold and Rebalancing pages on named allocations. Allocations (10 predefined, read-only, plus your custom ones) are kept in config/asset_allocations.json through AllocationStore (atomic writes, recreated when missing, validated: weights add up to 100, no negatives, known assets, unique name up to 50 characters). Engine: run_backtest(allocation, start, end, amount, rebalance none / monthly / quarterly / yearly on the first trading day of each period), prices carried forward at most 5 days, cash compounded over 252 days, cost hook. Results: summary cards (final value, total return, CAGR, max drawdown with dates, volatility), equity curve, stacked value per asset, calendar-year returns, asset contribution; the Rebalancing page adds the number of rebalances, a paginated rebalance log and a comparison with buy and hold. Manage allocations: new, duplicate, edit / delete custom, export and import JSON.</w:t>
+        <w:t xml:space="preserve">Charts and tables: portfolio vs 100% in each asset and inflation; drawdown chart with worst-fall chips; allocation donut; comparison table; Year by year table with a '1995 Dec close (buy)' row showing the Nifty shares and gold grams bought and the closing prices they were bought at (Nifty 909.00, gold Rs 462.42 per gram).</w:t>
+      </w:r>
+    </w:p>
+    <w:p>
+      <w:pPr>
+        <w:pStyle w:val="ListParagraph"/>
+        <w:numPr>
+          <w:ilvl w:val="0"/>
+          <w:numId w:val="2"/>
+        </w:numPr>
+        <w:spacing w:after="80"/>
+      </w:pPr>
+      <w:r>
+        <w:rPr>
+          <w:rFonts w:ascii="Calibri" w:cs="Calibri" w:eastAsia="Calibri" w:hAnsi="Calibri"/>
+        </w:rPr>
+        <w:t xml:space="preserve">Rebalance tab: value with vs without rebalancing, the latest review's buy / reduce amounts and a Year by year (with rebalancing) table like the main page's: the 1995 Dec buy row, then every December the amount in each asset at the close (Nifty shares / gold grams held at that price), what is sold or bought (with the shares / grams), and the amount and shares after; shares and grams change only in a December when the portfolio is rebalanced.</w:t>
+      </w:r>
+    </w:p>
+    <w:p>
+      <w:pPr>
+        <w:pStyle w:val="ListParagraph"/>
+        <w:numPr>
+          <w:ilvl w:val="0"/>
+          <w:numId w:val="2"/>
+        </w:numPr>
+        <w:spacing w:after="80"/>
+      </w:pPr>
+      <w:r>
+        <w:rPr>
+          <w:rFonts w:ascii="Calibri" w:cs="Calibri" w:eastAsia="Calibri" w:hAnsi="Calibri"/>
+        </w:rPr>
+        <w:t xml:space="preserve">Backtester tab: daily-close Buy &amp; Hold and Rebalancing pages on named allocations. Allocations (10 predefined, read-only, plus your custom ones) are kept in config/asset_allocations.json through AllocationStore (atomic writes, recreated when missing, validated: weights add up to 100, no negatives, known assets, unique name up to 50 characters). Engine: run_backtest(allocation, start, end, amount, rebalance none / monthly / quarterly / yearly on the first trading day of each period), prices carried forward at most 5 days, cash compounded over 252 days, cost hook. Results: summary cards (final value, total return, CAGR, max drawdown with dates, volatility), one value chart (100% in each asset, Inflation, My Portfolio) with the drawdown chart below, calendar-year returns, asset contribution; the Rebalancing page adds the number of rebalances, a paginated rebalance log and a comparison with buy and hold. Manage allocations: new, duplicate, edit / delete custom, export and import JSON.</w:t>
       </w:r>
     </w:p>
     <w:p>
@@ -4112,6 +4144,54 @@
         <w:rPr>
           <w:rFonts w:ascii="Calibri" w:cs="Calibri" w:eastAsia="Calibri" w:hAnsi="Calibri"/>
         </w:rPr>
+        <w:t xml:space="preserve">Bonds now earn one return per year (Jan to Dec), added once in December; December and final values are unchanged.</w:t>
+      </w:r>
+    </w:p>
+    <w:p>
+      <w:pPr>
+        <w:pStyle w:val="ListParagraph"/>
+        <w:numPr>
+          <w:ilvl w:val="0"/>
+          <w:numId w:val="2"/>
+        </w:numPr>
+        <w:spacing w:after="80"/>
+      </w:pPr>
+      <w:r>
+        <w:rPr>
+          <w:rFonts w:ascii="Calibri" w:cs="Calibri" w:eastAsia="Calibri" w:hAnsi="Calibri"/>
+        </w:rPr>
+        <w:t xml:space="preserve">Inflation added to every chart: the Backtester API sends an inflation line (annual CPI rate from the API, compounded over the days), and every drawdown chart shows My Portfolio after inflation.</w:t>
+      </w:r>
+    </w:p>
+    <w:p>
+      <w:pPr>
+        <w:pStyle w:val="ListParagraph"/>
+        <w:numPr>
+          <w:ilvl w:val="0"/>
+          <w:numId w:val="2"/>
+        </w:numPr>
+        <w:spacing w:after="80"/>
+      </w:pPr>
+      <w:r>
+        <w:rPr>
+          <w:rFonts w:ascii="Calibri" w:cs="Calibri" w:eastAsia="Calibri" w:hAnsi="Calibri"/>
+        </w:rPr>
+        <w:t xml:space="preserve">Code on GitHub: https://github.com/srchains/asset-allocation-backtest- (private).</w:t>
+      </w:r>
+    </w:p>
+    <w:p>
+      <w:pPr>
+        <w:pStyle w:val="ListParagraph"/>
+        <w:numPr>
+          <w:ilvl w:val="0"/>
+          <w:numId w:val="2"/>
+        </w:numPr>
+        <w:spacing w:after="80"/>
+      </w:pPr>
+      <w:r>
+        <w:rPr>
+          <w:rFonts w:ascii="Calibri" w:cs="Calibri" w:eastAsia="Calibri" w:hAnsi="Calibri"/>
+        </w:rPr>
         <w:t xml:space="preserve">Fixed: CAGR and Sharpe now count the number of periods between values correctly and include the first year's return.</w:t>
       </w:r>
     </w:p>
@@ -4760,7 +4840,7 @@
           <w:sz w:val="19"/>
           <w:szCs w:val="19"/>
         </w:rPr>
-        <w:t xml:space="preserve">$env:TRADEENTRY_TOKEN = "tat_xxxxxxxx"      # PowerShell</w:t>
+        <w:t xml:space="preserve">$env:TRADEENTRY_TOKEN = Read-Host "TradeEntry token"   # PowerShell</w:t>
       </w:r>
     </w:p>
     <w:p>
@@ -4847,7 +4927,7 @@
           <w:sz w:val="19"/>
           <w:szCs w:val="19"/>
         </w:rPr>
-        <w:t xml:space="preserve">uvicorn server:app --reload --port 8000</w:t>
+        <w:t xml:space="preserve">python -m uvicorn server:app --port 8000      # window 1, project root</w:t>
       </w:r>
     </w:p>
     <w:p>
@@ -4861,7 +4941,52 @@
           <w:sz w:val="19"/>
           <w:szCs w:val="19"/>
         </w:rPr>
-        <w:t xml:space="preserve">cd web &amp;&amp; npm run dev</w:t>
+        <w:t xml:space="preserve">cd web; npm run dev                           # window 2, then open http://localhost:5173</w:t>
+      </w:r>
+    </w:p>
+    <w:p>
+      <w:pPr>
+        <w:pStyle w:val="Heading2"/>
+        <w:spacing w:after="120" w:before="260"/>
+      </w:pPr>
+      <w:r>
+        <w:rPr>
+          <w:rFonts w:ascii="Calibri" w:cs="Calibri" w:eastAsia="Calibri" w:hAnsi="Calibri"/>
+          <w:b/>
+          <w:bCs/>
+          <w:color w:val="0E7C86"/>
+          <w:sz w:val="25"/>
+          <w:szCs w:val="25"/>
+        </w:rPr>
+        <w:t xml:space="preserve">First time only</w:t>
+      </w:r>
+    </w:p>
+    <w:p>
+      <w:pPr>
+        <w:shd w:fill="F2F4F7" w:val="clear"/>
+        <w:spacing w:after="60"/>
+      </w:pPr>
+      <w:r>
+        <w:rPr>
+          <w:rFonts w:ascii="Consolas" w:cs="Consolas" w:eastAsia="Consolas" w:hAnsi="Consolas"/>
+          <w:sz w:val="19"/>
+          <w:szCs w:val="19"/>
+        </w:rPr>
+        <w:t xml:space="preserve">pip install -r requirements.txt</w:t>
+      </w:r>
+    </w:p>
+    <w:p>
+      <w:pPr>
+        <w:shd w:fill="F2F4F7" w:val="clear"/>
+        <w:spacing w:after="60"/>
+      </w:pPr>
+      <w:r>
+        <w:rPr>
+          <w:rFonts w:ascii="Consolas" w:cs="Consolas" w:eastAsia="Consolas" w:hAnsi="Consolas"/>
+          <w:sz w:val="19"/>
+          <w:szCs w:val="19"/>
+        </w:rPr>
+        <w:t xml:space="preserve">cd web; npm install</w:t>
       </w:r>
     </w:p>
     <w:p>

</xml_diff>

<commit_message>
Bonds FD 1995-2014 + G-sec 2015+, Dec-1994 start, rebalance page and export updates
- Bonds: each year's own SBI FD rate to 2014, then the G-sec index; backtest starts at the Dec-1994 close
- Rebalance page: as-of-now position, without-rebalance and latest-price options, CAGR on the totals
- Excel/PDF: price, qty, value per asset with group headings; After inflation column removed
- Last update shows the newest day of data; data reloads every day
- Larger header text, cleanup of unused files and docs

Co-Authored-By: Claude Sonnet 5.5 <noreply@anthropic.com>
</commit_message>
<xml_diff>
--- a/docs/Asset_Allocation_Backtest_Project_Detail.docx
+++ b/docs/Asset_Allocation_Backtest_Project_Detail.docx
@@ -636,7 +636,7 @@
               <w:rPr>
                 <w:rFonts w:ascii="Calibri" w:cs="Calibri" w:eastAsia="Calibri" w:hAnsi="Calibri"/>
               </w:rPr>
-              <w:t xml:space="preserve">pytest (136 tests: backtest logic, monthly and December-only data, API endpoints; the live-data tests need the token)</w:t>
+              <w:t xml:space="preserve">pytest (124 tests: backtest logic, monthly and December-only data, API endpoints; the live-data tests need the token)</w:t>
             </w:r>
           </w:p>
         </w:tc>
@@ -986,7 +986,7 @@
               <w:rPr>
                 <w:rFonts w:ascii="Calibri" w:cs="Calibri" w:eastAsia="Calibri" w:hAnsi="Calibri"/>
               </w:rPr>
-              <w:t xml:space="preserve">scripts/nse_index_history.py</w:t>
+              <w:t xml:space="preserve">tests/</w:t>
             </w:r>
           </w:p>
         </w:tc>
@@ -1012,7 +1012,7 @@
               <w:rPr>
                 <w:rFonts w:ascii="Calibri" w:cs="Calibri" w:eastAsia="Calibri" w:hAnsi="Calibri"/>
               </w:rPr>
-              <w:t xml:space="preserve">Stand-alone tool to download NSE index history to CSV (not used by the app)</w:t>
+              <w:t xml:space="preserve">pytest suite for the backtest logic and the API endpoints</w:t>
             </w:r>
           </w:p>
         </w:tc>
@@ -1042,7 +1042,7 @@
               <w:rPr>
                 <w:rFonts w:ascii="Calibri" w:cs="Calibri" w:eastAsia="Calibri" w:hAnsi="Calibri"/>
               </w:rPr>
-              <w:t xml:space="preserve">tests/</w:t>
+              <w:t xml:space="preserve">requirements.txt</w:t>
             </w:r>
           </w:p>
         </w:tc>
@@ -1067,7 +1067,7 @@
               <w:rPr>
                 <w:rFonts w:ascii="Calibri" w:cs="Calibri" w:eastAsia="Calibri" w:hAnsi="Calibri"/>
               </w:rPr>
-              <w:t xml:space="preserve">pytest suite for the backtest logic and the API endpoints</w:t>
+              <w:t xml:space="preserve">Backend Python dependencies</w:t>
             </w:r>
           </w:p>
         </w:tc>
@@ -1098,7 +1098,7 @@
               <w:rPr>
                 <w:rFonts w:ascii="Calibri" w:cs="Calibri" w:eastAsia="Calibri" w:hAnsi="Calibri"/>
               </w:rPr>
-              <w:t xml:space="preserve">requirements.txt</w:t>
+              <w:t xml:space="preserve">package.json</w:t>
             </w:r>
           </w:p>
         </w:tc>
@@ -1124,7 +1124,7 @@
               <w:rPr>
                 <w:rFonts w:ascii="Calibri" w:cs="Calibri" w:eastAsia="Calibri" w:hAnsi="Calibri"/>
               </w:rPr>
-              <w:t xml:space="preserve">Backend Python dependencies</w:t>
+              <w:t xml:space="preserve">Root scripts: npm run dev starts backend + frontend together</w:t>
             </w:r>
           </w:p>
         </w:tc>
@@ -1154,7 +1154,7 @@
               <w:rPr>
                 <w:rFonts w:ascii="Calibri" w:cs="Calibri" w:eastAsia="Calibri" w:hAnsi="Calibri"/>
               </w:rPr>
-              <w:t xml:space="preserve">package.json</w:t>
+              <w:t xml:space="preserve">web/src/App.tsx</w:t>
             </w:r>
           </w:p>
         </w:tc>
@@ -1179,7 +1179,7 @@
               <w:rPr>
                 <w:rFonts w:ascii="Calibri" w:cs="Calibri" w:eastAsia="Calibri" w:hAnsi="Calibri"/>
               </w:rPr>
-              <w:t xml:space="preserve">Root scripts: npm run dev starts backend + frontend together</w:t>
+              <w:t xml:space="preserve">Main UI: allocation sliders, period picker, charts, tables, Rebalance page</w:t>
             </w:r>
           </w:p>
         </w:tc>
@@ -1210,7 +1210,7 @@
               <w:rPr>
                 <w:rFonts w:ascii="Calibri" w:cs="Calibri" w:eastAsia="Calibri" w:hAnsi="Calibri"/>
               </w:rPr>
-              <w:t xml:space="preserve">web/src/App.tsx</w:t>
+              <w:t xml:space="preserve">web/src/api.ts</w:t>
             </w:r>
           </w:p>
         </w:tc>
@@ -1236,7 +1236,7 @@
               <w:rPr>
                 <w:rFonts w:ascii="Calibri" w:cs="Calibri" w:eastAsia="Calibri" w:hAnsi="Calibri"/>
               </w:rPr>
-              <w:t xml:space="preserve">Main UI: allocation sliders, period picker, charts, tables, Rebalance page</w:t>
+              <w:t xml:space="preserve">Fetches /api/range and /api/backtest from the backend</w:t>
             </w:r>
           </w:p>
         </w:tc>
@@ -1266,7 +1266,7 @@
               <w:rPr>
                 <w:rFonts w:ascii="Calibri" w:cs="Calibri" w:eastAsia="Calibri" w:hAnsi="Calibri"/>
               </w:rPr>
-              <w:t xml:space="preserve">web/src/api.ts</w:t>
+              <w:t xml:space="preserve">web/src/exportYearly.ts</w:t>
             </w:r>
           </w:p>
         </w:tc>
@@ -1291,7 +1291,7 @@
               <w:rPr>
                 <w:rFonts w:ascii="Calibri" w:cs="Calibri" w:eastAsia="Calibri" w:hAnsi="Calibri"/>
               </w:rPr>
-              <w:t xml:space="preserve">Fetches /api/range and /api/backtest from the backend</w:t>
+              <w:t xml:space="preserve">Excel / PDF download helpers</w:t>
             </w:r>
           </w:p>
         </w:tc>
@@ -1322,7 +1322,7 @@
               <w:rPr>
                 <w:rFonts w:ascii="Calibri" w:cs="Calibri" w:eastAsia="Calibri" w:hAnsi="Calibri"/>
               </w:rPr>
-              <w:t xml:space="preserve">web/src/exportYearly.ts</w:t>
+              <w:t xml:space="preserve">web/vite.config.ts</w:t>
             </w:r>
           </w:p>
         </w:tc>
@@ -1348,7 +1348,7 @@
               <w:rPr>
                 <w:rFonts w:ascii="Calibri" w:cs="Calibri" w:eastAsia="Calibri" w:hAnsi="Calibri"/>
               </w:rPr>
-              <w:t xml:space="preserve">Excel / PDF download helpers</w:t>
+              <w:t xml:space="preserve">Dev server; proxies /api/* to the backend on :8000</w:t>
             </w:r>
           </w:p>
         </w:tc>
@@ -1378,7 +1378,7 @@
               <w:rPr>
                 <w:rFonts w:ascii="Calibri" w:cs="Calibri" w:eastAsia="Calibri" w:hAnsi="Calibri"/>
               </w:rPr>
-              <w:t xml:space="preserve">web/vite.config.ts</w:t>
+              <w:t xml:space="preserve">calculation.xlsx</w:t>
             </w:r>
           </w:p>
         </w:tc>
@@ -1403,7 +1403,7 @@
               <w:rPr>
                 <w:rFonts w:ascii="Calibri" w:cs="Calibri" w:eastAsia="Calibri" w:hAnsi="Calibri"/>
               </w:rPr>
-              <w:t xml:space="preserve">Dev server; proxies /api/* to the backend on :8000</w:t>
+              <w:t xml:space="preserve">Excel workbook mirroring the app's monthly math with live formulas</w:t>
             </w:r>
           </w:p>
         </w:tc>
@@ -1434,7 +1434,7 @@
               <w:rPr>
                 <w:rFonts w:ascii="Calibri" w:cs="Calibri" w:eastAsia="Calibri" w:hAnsi="Calibri"/>
               </w:rPr>
-              <w:t xml:space="preserve">calculation.xlsx</w:t>
+              <w:t xml:space="preserve">docs/</w:t>
             </w:r>
           </w:p>
         </w:tc>
@@ -1448,61 +1448,6 @@
               <w:right w:val="single" w:color="BFC5CF" w:sz="4"/>
             </w:tcBorders>
             <w:shd w:fill="F2F4F7" w:val="clear"/>
-            <w:tcMar>
-              <w:top w:type="dxa" w:w="80"/>
-              <w:left w:type="dxa" w:w="100"/>
-              <w:bottom w:type="dxa" w:w="80"/>
-              <w:right w:type="dxa" w:w="100"/>
-            </w:tcMar>
-          </w:tcPr>
-          <w:p>
-            <w:r>
-              <w:rPr>
-                <w:rFonts w:ascii="Calibri" w:cs="Calibri" w:eastAsia="Calibri" w:hAnsi="Calibri"/>
-              </w:rPr>
-              <w:t xml:space="preserve">Excel workbook mirroring the app's monthly math with live formulas</w:t>
-            </w:r>
-          </w:p>
-        </w:tc>
-      </w:tr>
-      <w:tr>
-        <w:trPr>
-          <w:tblHeader w:val="off"/>
-        </w:trPr>
-        <w:tc>
-          <w:tcPr>
-            <w:tcW w:type="dxa" w:w="3600"/>
-            <w:tcBorders>
-              <w:top w:val="single" w:color="BFC5CF" w:sz="4"/>
-              <w:left w:val="single" w:color="BFC5CF" w:sz="4"/>
-              <w:bottom w:val="single" w:color="BFC5CF" w:sz="4"/>
-              <w:right w:val="single" w:color="BFC5CF" w:sz="4"/>
-            </w:tcBorders>
-            <w:tcMar>
-              <w:top w:type="dxa" w:w="80"/>
-              <w:left w:type="dxa" w:w="100"/>
-              <w:bottom w:type="dxa" w:w="80"/>
-              <w:right w:type="dxa" w:w="100"/>
-            </w:tcMar>
-          </w:tcPr>
-          <w:p>
-            <w:r>
-              <w:rPr>
-                <w:rFonts w:ascii="Calibri" w:cs="Calibri" w:eastAsia="Calibri" w:hAnsi="Calibri"/>
-              </w:rPr>
-              <w:t xml:space="preserve">docs/</w:t>
-            </w:r>
-          </w:p>
-        </w:tc>
-        <w:tc>
-          <w:tcPr>
-            <w:tcW w:type="dxa" w:w="6480"/>
-            <w:tcBorders>
-              <w:top w:val="single" w:color="BFC5CF" w:sz="4"/>
-              <w:left w:val="single" w:color="BFC5CF" w:sz="4"/>
-              <w:bottom w:val="single" w:color="BFC5CF" w:sz="4"/>
-              <w:right w:val="single" w:color="BFC5CF" w:sz="4"/>
-            </w:tcBorders>
             <w:tcMar>
               <w:top w:type="dxa" w:w="80"/>
               <w:left w:type="dxa" w:w="100"/>
@@ -3283,7 +3228,7 @@
         <w:rPr>
           <w:rFonts w:ascii="Calibri" w:cs="Calibri" w:eastAsia="Calibri" w:hAnsi="Calibri"/>
         </w:rPr>
-        <w:t xml:space="preserve">Tabs (card tabs with icons): Asset Allocation, Rebalance, Backtester, Saved plans. Save as plan (under the sliders) stores the weights as a custom allocation; the Saved plans tab loads one back into the sliders or opens it in the Backtester.</w:t>
+        <w:t xml:space="preserve">Tabs (card tabs with icons): Asset Allocation, Rebalance, Comparison chart. Save as plan (under the sliders) stores the weights as a custom allocation; the Open plan button above the sliders lists every plan and loads the one you click. A Log scale checkbox on the value charts switches the Y axis to a log scale (the same % growth has the same height); unticked is the normal rupee axis.</w:t>
       </w:r>
     </w:p>
     <w:p>
@@ -3363,7 +3308,7 @@
         <w:rPr>
           <w:rFonts w:ascii="Calibri" w:cs="Calibri" w:eastAsia="Calibri" w:hAnsi="Calibri"/>
         </w:rPr>
-        <w:t xml:space="preserve">Download buttons (Excel or PDF) on the Year by year table and the Year by year (with rebalancing) table; PDFs write 'Rs' because the standard PDF fonts have no rupee sign.</w:t>
+        <w:t xml:space="preserve">Download buttons (Excel or PDF) on the Year by year table and the Year by year (with rebalancing) table. Every file has one structure: a coloured group row (NIFTY, GOLD, BONDS, CASH, PORTFOLIO, RETURNS) over the columns, and for each asset its price, the quantity held and the value (Nifty in shares, gold in grams; Bonds and Cash in rupees). The Rebalance download also has the buy / sell table (second sheet in Excel, second page in the PDF). PDFs write 'Rs' because the standard PDF fonts have no rupee sign.</w:t>
       </w:r>
     </w:p>
     <w:p>
@@ -4708,7 +4653,7 @@
               <w:rPr>
                 <w:rFonts w:ascii="Calibri" w:cs="Calibri" w:eastAsia="Calibri" w:hAnsi="Calibri"/>
               </w:rPr>
-              <w:t xml:space="preserve">build_midsmallcap_csv.py</w:t>
+              <w:t xml:space="preserve">API tokens</w:t>
             </w:r>
           </w:p>
         </w:tc>
@@ -4722,61 +4667,6 @@
               <w:right w:val="single" w:color="BFC5CF" w:sz="4"/>
             </w:tcBorders>
             <w:shd w:fill="F2F4F7" w:val="clear"/>
-            <w:tcMar>
-              <w:top w:type="dxa" w:w="80"/>
-              <w:left w:type="dxa" w:w="100"/>
-              <w:bottom w:type="dxa" w:w="80"/>
-              <w:right w:type="dxa" w:w="100"/>
-            </w:tcMar>
-          </w:tcPr>
-          <w:p>
-            <w:r>
-              <w:rPr>
-                <w:rFonts w:ascii="Calibri" w:cs="Calibri" w:eastAsia="Calibri" w:hAnsi="Calibri"/>
-              </w:rPr>
-              <w:t xml:space="preserve">Obsolete (it needs the removed local files) and can be deleted.</w:t>
-            </w:r>
-          </w:p>
-        </w:tc>
-      </w:tr>
-      <w:tr>
-        <w:trPr>
-          <w:tblHeader w:val="off"/>
-        </w:trPr>
-        <w:tc>
-          <w:tcPr>
-            <w:tcW w:type="dxa" w:w="4800"/>
-            <w:tcBorders>
-              <w:top w:val="single" w:color="BFC5CF" w:sz="4"/>
-              <w:left w:val="single" w:color="BFC5CF" w:sz="4"/>
-              <w:bottom w:val="single" w:color="BFC5CF" w:sz="4"/>
-              <w:right w:val="single" w:color="BFC5CF" w:sz="4"/>
-            </w:tcBorders>
-            <w:tcMar>
-              <w:top w:type="dxa" w:w="80"/>
-              <w:left w:type="dxa" w:w="100"/>
-              <w:bottom w:type="dxa" w:w="80"/>
-              <w:right w:type="dxa" w:w="100"/>
-            </w:tcMar>
-          </w:tcPr>
-          <w:p>
-            <w:r>
-              <w:rPr>
-                <w:rFonts w:ascii="Calibri" w:cs="Calibri" w:eastAsia="Calibri" w:hAnsi="Calibri"/>
-              </w:rPr>
-              <w:t xml:space="preserve">API tokens</w:t>
-            </w:r>
-          </w:p>
-        </w:tc>
-        <w:tc>
-          <w:tcPr>
-            <w:tcW w:type="dxa" w:w="5280"/>
-            <w:tcBorders>
-              <w:top w:val="single" w:color="BFC5CF" w:sz="4"/>
-              <w:left w:val="single" w:color="BFC5CF" w:sz="4"/>
-              <w:bottom w:val="single" w:color="BFC5CF" w:sz="4"/>
-              <w:right w:val="single" w:color="BFC5CF" w:sz="4"/>
-            </w:tcBorders>
             <w:tcMar>
               <w:top w:type="dxa" w:w="80"/>
               <w:left w:type="dxa" w:w="100"/>

</xml_diff>